<commit_message>
Chapitre 5 seul, pour validation par la directrice de mémoire
faire-resultats-validation.mjs produit le chapitre Résultats tel qu'il
figure dans le mémoire (mêmes contrôles, même mise en forme, tableaux IV
à VII), précédé d'une page de garde. Mise en forme commune : la mention
de source reste avec la dernière ligne de son tableau, les intertitres
et l'en-tête d'un tableau restent avec la ligne qui suit.

Co-Authored-By: Claude Opus 5.5 <noreply@anthropic.com>
Claude-Session: https://claude.ai/code/session_01HxwPseJn9EZbm4HRSeCoVh
</commit_message>
<xml_diff>
--- a/memoire-ngoma/livrables/Chapitre_5_Resultats.docx
+++ b/memoire-ngoma/livrables/Chapitre_5_Resultats.docx
@@ -2376,6 +2376,7 @@
           </w:tcPr>
           <w:p>
             <w:pPr>
+              <w:keepNext/>
               <w:jc w:val="left"/>
             </w:pPr>
             <w:r>
@@ -2402,6 +2403,7 @@
           </w:tcPr>
           <w:p>
             <w:pPr>
+              <w:keepNext/>
               <w:jc w:val="left"/>
             </w:pPr>
             <w:r>
@@ -2428,6 +2430,7 @@
           </w:tcPr>
           <w:p>
             <w:pPr>
+              <w:keepNext/>
               <w:jc w:val="left"/>
             </w:pPr>
             <w:r>
@@ -2454,6 +2457,7 @@
           </w:tcPr>
           <w:p>
             <w:pPr>
+              <w:keepNext/>
               <w:jc w:val="left"/>
             </w:pPr>
             <w:r>
@@ -2485,6 +2489,9 @@
             </w:tcMar>
           </w:tcPr>
           <w:p>
+            <w:pPr>
+              <w:keepNext/>
+            </w:pPr>
             <w:r>
               <w:rPr>
                 <w:b/>
@@ -2515,6 +2522,7 @@
           </w:tcPr>
           <w:p>
             <w:pPr>
+              <w:keepNext w:val="false"/>
               <w:jc w:val="left"/>
             </w:pPr>
             <w:r>
@@ -2540,6 +2548,7 @@
           </w:tcPr>
           <w:p>
             <w:pPr>
+              <w:keepNext w:val="false"/>
               <w:jc w:val="center"/>
             </w:pPr>
             <w:r>
@@ -2565,6 +2574,7 @@
           </w:tcPr>
           <w:p>
             <w:pPr>
+              <w:keepNext w:val="false"/>
               <w:jc w:val="center"/>
             </w:pPr>
             <w:r>
@@ -2590,6 +2600,7 @@
           </w:tcPr>
           <w:p>
             <w:pPr>
+              <w:keepNext w:val="false"/>
               <w:jc w:val="center"/>
             </w:pPr>
             <w:r>
@@ -2620,6 +2631,7 @@
           </w:tcPr>
           <w:p>
             <w:pPr>
+              <w:keepNext w:val="false"/>
               <w:jc w:val="left"/>
             </w:pPr>
             <w:r>
@@ -2645,6 +2657,7 @@
           </w:tcPr>
           <w:p>
             <w:pPr>
+              <w:keepNext w:val="false"/>
               <w:jc w:val="center"/>
             </w:pPr>
             <w:r>
@@ -2670,6 +2683,7 @@
           </w:tcPr>
           <w:p>
             <w:pPr>
+              <w:keepNext w:val="false"/>
               <w:jc w:val="center"/>
             </w:pPr>
             <w:r>
@@ -2695,6 +2709,7 @@
           </w:tcPr>
           <w:p>
             <w:pPr>
+              <w:keepNext w:val="false"/>
               <w:jc w:val="center"/>
             </w:pPr>
             <w:r>
@@ -2725,6 +2740,7 @@
           </w:tcPr>
           <w:p>
             <w:pPr>
+              <w:keepNext w:val="false"/>
               <w:jc w:val="left"/>
             </w:pPr>
             <w:r>
@@ -2750,6 +2766,7 @@
           </w:tcPr>
           <w:p>
             <w:pPr>
+              <w:keepNext w:val="false"/>
               <w:jc w:val="center"/>
             </w:pPr>
             <w:r>
@@ -2775,6 +2792,7 @@
           </w:tcPr>
           <w:p>
             <w:pPr>
+              <w:keepNext w:val="false"/>
               <w:jc w:val="center"/>
             </w:pPr>
             <w:r>
@@ -2800,6 +2818,7 @@
           </w:tcPr>
           <w:p>
             <w:pPr>
+              <w:keepNext w:val="false"/>
               <w:jc w:val="center"/>
             </w:pPr>
             <w:r>
@@ -2831,6 +2850,9 @@
             </w:tcMar>
           </w:tcPr>
           <w:p>
+            <w:pPr>
+              <w:keepNext/>
+            </w:pPr>
             <w:r>
               <w:rPr>
                 <w:b/>
@@ -2861,6 +2883,7 @@
           </w:tcPr>
           <w:p>
             <w:pPr>
+              <w:keepNext w:val="false"/>
               <w:jc w:val="left"/>
             </w:pPr>
             <w:r>
@@ -2886,6 +2909,7 @@
           </w:tcPr>
           <w:p>
             <w:pPr>
+              <w:keepNext w:val="false"/>
               <w:jc w:val="center"/>
             </w:pPr>
             <w:r>
@@ -2911,6 +2935,7 @@
           </w:tcPr>
           <w:p>
             <w:pPr>
+              <w:keepNext w:val="false"/>
               <w:jc w:val="center"/>
             </w:pPr>
             <w:r>
@@ -2936,6 +2961,7 @@
           </w:tcPr>
           <w:p>
             <w:pPr>
+              <w:keepNext w:val="false"/>
               <w:jc w:val="center"/>
             </w:pPr>
             <w:r>
@@ -2966,6 +2992,7 @@
           </w:tcPr>
           <w:p>
             <w:pPr>
+              <w:keepNext w:val="false"/>
               <w:jc w:val="left"/>
             </w:pPr>
             <w:r>
@@ -2991,6 +3018,7 @@
           </w:tcPr>
           <w:p>
             <w:pPr>
+              <w:keepNext w:val="false"/>
               <w:jc w:val="center"/>
             </w:pPr>
             <w:r>
@@ -3016,6 +3044,7 @@
           </w:tcPr>
           <w:p>
             <w:pPr>
+              <w:keepNext w:val="false"/>
               <w:jc w:val="center"/>
             </w:pPr>
             <w:r>
@@ -3041,6 +3070,7 @@
           </w:tcPr>
           <w:p>
             <w:pPr>
+              <w:keepNext w:val="false"/>
               <w:jc w:val="center"/>
             </w:pPr>
             <w:r>
@@ -3072,6 +3102,9 @@
             </w:tcMar>
           </w:tcPr>
           <w:p>
+            <w:pPr>
+              <w:keepNext/>
+            </w:pPr>
             <w:r>
               <w:rPr>
                 <w:b/>
@@ -3102,6 +3135,7 @@
           </w:tcPr>
           <w:p>
             <w:pPr>
+              <w:keepNext w:val="false"/>
               <w:jc w:val="left"/>
             </w:pPr>
             <w:r>
@@ -3127,6 +3161,7 @@
           </w:tcPr>
           <w:p>
             <w:pPr>
+              <w:keepNext w:val="false"/>
               <w:jc w:val="center"/>
             </w:pPr>
             <w:r>
@@ -3152,6 +3187,7 @@
           </w:tcPr>
           <w:p>
             <w:pPr>
+              <w:keepNext w:val="false"/>
               <w:jc w:val="center"/>
             </w:pPr>
             <w:r>
@@ -3177,6 +3213,7 @@
           </w:tcPr>
           <w:p>
             <w:pPr>
+              <w:keepNext w:val="false"/>
               <w:jc w:val="center"/>
             </w:pPr>
             <w:r>
@@ -3207,6 +3244,7 @@
           </w:tcPr>
           <w:p>
             <w:pPr>
+              <w:keepNext w:val="false"/>
               <w:jc w:val="left"/>
             </w:pPr>
             <w:r>
@@ -3232,6 +3270,7 @@
           </w:tcPr>
           <w:p>
             <w:pPr>
+              <w:keepNext w:val="false"/>
               <w:jc w:val="center"/>
             </w:pPr>
             <w:r>
@@ -3257,6 +3296,7 @@
           </w:tcPr>
           <w:p>
             <w:pPr>
+              <w:keepNext w:val="false"/>
               <w:jc w:val="center"/>
             </w:pPr>
             <w:r>
@@ -3282,6 +3322,7 @@
           </w:tcPr>
           <w:p>
             <w:pPr>
+              <w:keepNext w:val="false"/>
               <w:jc w:val="center"/>
             </w:pPr>
             <w:r>
@@ -3312,6 +3353,7 @@
           </w:tcPr>
           <w:p>
             <w:pPr>
+              <w:keepNext w:val="false"/>
               <w:jc w:val="left"/>
             </w:pPr>
             <w:r>
@@ -3337,6 +3379,7 @@
           </w:tcPr>
           <w:p>
             <w:pPr>
+              <w:keepNext w:val="false"/>
               <w:jc w:val="center"/>
             </w:pPr>
             <w:r>
@@ -3362,6 +3405,7 @@
           </w:tcPr>
           <w:p>
             <w:pPr>
+              <w:keepNext w:val="false"/>
               <w:jc w:val="center"/>
             </w:pPr>
             <w:r>
@@ -3387,6 +3431,7 @@
           </w:tcPr>
           <w:p>
             <w:pPr>
+              <w:keepNext w:val="false"/>
               <w:jc w:val="center"/>
             </w:pPr>
             <w:r>

</xml_diff>